<commit_message>
Commit 3. Dron estable
finalmente me llego el dron nuevo, el cual si es capaz de cargar algo y si es estable, ahora seria cuestión de controlarlo con la IA
</commit_message>
<xml_diff>
--- a/Decima semana de Técnicas de Inteligencia Artificial.docx
+++ b/Decima semana de Técnicas de Inteligencia Artificial.docx
@@ -77,6 +77,35 @@
           <w:rtl w:val="0"/>
         </w:rPr>
         <w:t xml:space="preserve"> El día miércoles 28 de octubre el profesor dio continuidad al taller, solo que ahora fue más práctico, cuando el anterior fue más teórico.</w:t>
+      </w:r>
+    </w:p>
+    <w:p>
+      <w:pPr>
+        <w:rPr/>
+      </w:pPr>
+      <w:r>
+        <w:rPr>
+          <w:rtl w:val="0"/>
+        </w:rPr>
+      </w:r>
+    </w:p>
+    <w:p>
+      <w:pPr>
+        <w:rPr/>
+      </w:pPr>
+      <w:r>
+        <w:rPr>
+          <w:b w:val="1"/>
+          <w:bCs w:val="1"/>
+          <w:rtl w:val="0"/>
+        </w:rPr>
+        <w:t xml:space="preserve">Actividad 3:</w:t>
+      </w:r>
+      <w:r>
+        <w:rPr>
+          <w:rtl w:val="0"/>
+        </w:rPr>
+        <w:t xml:space="preserve"> El día Jueves 29 de octubre finalmente recibí el dron nuevo, el cual es capaz de cargar una caja de cartón con cositas dentro, y si es totalmente estable, asi que solo seria cuestion de empezar a trabajar con el control por IA.</w:t>
       </w:r>
     </w:p>
     <w:sectPr>

</xml_diff>